<commit_message>
Task 6004: Coding - Upgrade the sample application to support SEB use cases - PBI 6003: NFK-05 PoC - FK BvS, TK-02
</commit_message>
<xml_diff>
--- a/D.03.08.00010_2H-31_Guideline_Web_Net.docx
+++ b/D.03.08.00010_2H-31_Guideline_Web_Net.docx
@@ -1,6 +1,6 @@
 
 <file path=word/document.xml><?xml version="1.0" encoding="utf-8"?>
-<w:document xmlns:wpc="http://schemas.microsoft.com/office/word/2010/wordprocessingCanvas" xmlns:mc="http://schemas.openxmlformats.org/markup-compatibility/2006" xmlns:o="urn:schemas-microsoft-com:office:office" xmlns:r="http://schemas.openxmlformats.org/officeDocument/2006/relationships" xmlns:m="http://schemas.openxmlformats.org/officeDocument/2006/math" xmlns:v="urn:schemas-microsoft-com:vml" xmlns:wp14="http://schemas.microsoft.com/office/word/2010/wordprocessingDrawing" xmlns:wp="http://schemas.openxmlformats.org/drawingml/2006/wordprocessingDrawing" xmlns:w10="urn:schemas-microsoft-com:office:word" xmlns:w="http://schemas.openxmlformats.org/wordprocessingml/2006/main" xmlns:w14="http://schemas.microsoft.com/office/word/2010/wordml" xmlns:w15="http://schemas.microsoft.com/office/word/2012/wordml" xmlns:wpg="http://schemas.microsoft.com/office/word/2010/wordprocessingGroup" xmlns:wpi="http://schemas.microsoft.com/office/word/2010/wordprocessingInk" xmlns:wne="http://schemas.microsoft.com/office/word/2006/wordml" xmlns:wps="http://schemas.microsoft.com/office/word/2010/wordprocessingShape" mc:Ignorable="w14 w15 wp14">
+<w:document xmlns:wpc="http://schemas.microsoft.com/office/word/2010/wordprocessingCanvas" xmlns:cx="http://schemas.microsoft.com/office/drawing/2014/chartex" xmlns:cx1="http://schemas.microsoft.com/office/drawing/2015/9/8/chartex" xmlns:cx2="http://schemas.microsoft.com/office/drawing/2015/10/21/chartex" xmlns:cx3="http://schemas.microsoft.com/office/drawing/2016/5/9/chartex" xmlns:cx4="http://schemas.microsoft.com/office/drawing/2016/5/10/chartex" xmlns:cx5="http://schemas.microsoft.com/office/drawing/2016/5/11/chartex" xmlns:cx6="http://schemas.microsoft.com/office/drawing/2016/5/12/chartex" xmlns:cx7="http://schemas.microsoft.com/office/drawing/2016/5/13/chartex" xmlns:cx8="http://schemas.microsoft.com/office/drawing/2016/5/14/chartex" xmlns:mc="http://schemas.openxmlformats.org/markup-compatibility/2006" xmlns:aink="http://schemas.microsoft.com/office/drawing/2016/ink" xmlns:am3d="http://schemas.microsoft.com/office/drawing/2017/model3d" xmlns:o="urn:schemas-microsoft-com:office:office" xmlns:oel="http://schemas.microsoft.com/office/2019/extlst" xmlns:r="http://schemas.openxmlformats.org/officeDocument/2006/relationships" xmlns:m="http://schemas.openxmlformats.org/officeDocument/2006/math" xmlns:v="urn:schemas-microsoft-com:vml" xmlns:wp14="http://schemas.microsoft.com/office/word/2010/wordprocessingDrawing" xmlns:wp="http://schemas.openxmlformats.org/drawingml/2006/wordprocessingDrawing" xmlns:w10="urn:schemas-microsoft-com:office:word" xmlns:w="http://schemas.openxmlformats.org/wordprocessingml/2006/main" xmlns:w14="http://schemas.microsoft.com/office/word/2010/wordml" xmlns:w15="http://schemas.microsoft.com/office/word/2012/wordml" xmlns:w16cex="http://schemas.microsoft.com/office/word/2018/wordml/cex" xmlns:w16cid="http://schemas.microsoft.com/office/word/2016/wordml/cid" xmlns:w16="http://schemas.microsoft.com/office/word/2018/wordml" xmlns:w16du="http://schemas.microsoft.com/office/word/2023/wordml/word16du" xmlns:w16sdtdh="http://schemas.microsoft.com/office/word/2020/wordml/sdtdatahash" xmlns:w16sdtfl="http://schemas.microsoft.com/office/word/2024/wordml/sdtformatlock" xmlns:w16se="http://schemas.microsoft.com/office/word/2015/wordml/symex" xmlns:wpg="http://schemas.microsoft.com/office/word/2010/wordprocessingGroup" xmlns:wpi="http://schemas.microsoft.com/office/word/2010/wordprocessingInk" xmlns:wne="http://schemas.microsoft.com/office/word/2006/wordml" xmlns:wps="http://schemas.microsoft.com/office/word/2010/wordprocessingShape" mc:Ignorable="w14 w15 w16se w16cid w16 w16cex w16sdtdh w16sdtfl w16du wp14">
   <w:body>
     <w:p>
       <w:pPr>
@@ -37,8 +37,8 @@
             <v:stroke joinstyle="miter"/>
             <v:path gradientshapeok="t" o:connecttype="rect"/>
           </v:shapetype>
-          <v:shape id="_x0000_s1033" type="#_x0000_t202" style="position:absolute;margin-left:266.5pt;margin-top:476.75pt;width:291.95pt;height:291.95pt;z-index:251656192;mso-position-horizontal-relative:page;mso-position-vertical-relative:page" fillcolor="#6579ae" stroked="f">
-            <v:textbox style="mso-next-textbox:#_x0000_s1033" inset=",3mm,,3mm">
+          <v:shape id="_x0000_s2057" type="#_x0000_t202" style="position:absolute;margin-left:266.5pt;margin-top:476.75pt;width:291.95pt;height:291.95pt;z-index:251656192;mso-position-horizontal-relative:page;mso-position-vertical-relative:page" fillcolor="#6579ae" stroked="f">
+            <v:textbox style="mso-next-textbox:#_x0000_s2057" inset=",3mm,,3mm">
               <w:txbxContent>
                 <w:p>
                   <w:pPr>
@@ -191,7 +191,39 @@
           <w:rFonts w:ascii="Helvetica Neue" w:hAnsi="Helvetica Neue"/>
           <w:color w:val="333333"/>
         </w:rPr>
-        <w:t>In the KOMBIT Støttesystemer information model, a web application that authenticates users based on an assertion issued by Context Handler (CH) is referred to as a Brugervendt system. In the following guide the terms</w:t>
+        <w:t xml:space="preserve">In the KOMBIT </w:t>
+      </w:r>
+      <w:proofErr w:type="spellStart"/>
+      <w:r>
+        <w:rPr>
+          <w:rFonts w:ascii="Helvetica Neue" w:hAnsi="Helvetica Neue"/>
+          <w:color w:val="333333"/>
+        </w:rPr>
+        <w:t>Støttesystemer</w:t>
+      </w:r>
+      <w:proofErr w:type="spellEnd"/>
+      <w:r>
+        <w:rPr>
+          <w:rFonts w:ascii="Helvetica Neue" w:hAnsi="Helvetica Neue"/>
+          <w:color w:val="333333"/>
+        </w:rPr>
+        <w:t xml:space="preserve"> information model, a web application that authenticates users based on an assertion issued by Context Handler (CH) is referred to as a </w:t>
+      </w:r>
+      <w:proofErr w:type="spellStart"/>
+      <w:r>
+        <w:rPr>
+          <w:rFonts w:ascii="Helvetica Neue" w:hAnsi="Helvetica Neue"/>
+          <w:color w:val="333333"/>
+        </w:rPr>
+        <w:t>Brugervendt</w:t>
+      </w:r>
+      <w:proofErr w:type="spellEnd"/>
+      <w:r>
+        <w:rPr>
+          <w:rFonts w:ascii="Helvetica Neue" w:hAnsi="Helvetica Neue"/>
+          <w:color w:val="333333"/>
+        </w:rPr>
+        <w:t xml:space="preserve"> system. In the following guide the terms</w:t>
       </w:r>
       <w:r>
         <w:rPr>
@@ -201,36 +233,58 @@
         </w:rPr>
         <w:t> </w:t>
       </w:r>
+      <w:proofErr w:type="spellStart"/>
       <w:r>
         <w:rPr>
           <w:rStyle w:val="HTMLCode"/>
           <w:rFonts w:ascii="Consolas" w:hAnsi="Consolas"/>
           <w:color w:val="333333"/>
         </w:rPr>
-        <w:t>Brugervendt system</w:t>
-      </w:r>
-      <w:r>
-        <w:rPr>
-          <w:rStyle w:val="apple-converted-space"/>
-          <w:rFonts w:ascii="Helvetica Neue" w:hAnsi="Helvetica Neue"/>
-          <w:color w:val="333333"/>
-        </w:rPr>
-        <w:t> </w:t>
-      </w:r>
-      <w:r>
-        <w:rPr>
-          <w:rFonts w:ascii="Helvetica Neue" w:hAnsi="Helvetica Neue"/>
-          <w:color w:val="333333"/>
-        </w:rPr>
-        <w:t>and</w:t>
-      </w:r>
+        <w:t>Brugervendt</w:t>
+      </w:r>
+      <w:proofErr w:type="spellEnd"/>
       <w:r>
         <w:rPr>
           <w:rStyle w:val="HTMLCode"/>
           <w:rFonts w:ascii="Consolas" w:hAnsi="Consolas"/>
           <w:color w:val="333333"/>
         </w:rPr>
-        <w:t>web application</w:t>
+        <w:t xml:space="preserve"> system</w:t>
+      </w:r>
+      <w:r>
+        <w:rPr>
+          <w:rStyle w:val="apple-converted-space"/>
+          <w:rFonts w:ascii="Helvetica Neue" w:hAnsi="Helvetica Neue"/>
+          <w:color w:val="333333"/>
+        </w:rPr>
+        <w:t> </w:t>
+      </w:r>
+      <w:proofErr w:type="spellStart"/>
+      <w:proofErr w:type="gramStart"/>
+      <w:r>
+        <w:rPr>
+          <w:rFonts w:ascii="Helvetica Neue" w:hAnsi="Helvetica Neue"/>
+          <w:color w:val="333333"/>
+        </w:rPr>
+        <w:t>and</w:t>
+      </w:r>
+      <w:r>
+        <w:rPr>
+          <w:rStyle w:val="HTMLCode"/>
+          <w:rFonts w:ascii="Consolas" w:hAnsi="Consolas"/>
+          <w:color w:val="333333"/>
+        </w:rPr>
+        <w:t>web</w:t>
+      </w:r>
+      <w:proofErr w:type="spellEnd"/>
+      <w:proofErr w:type="gramEnd"/>
+      <w:r>
+        <w:rPr>
+          <w:rStyle w:val="HTMLCode"/>
+          <w:rFonts w:ascii="Consolas" w:hAnsi="Consolas"/>
+          <w:color w:val="333333"/>
+        </w:rPr>
+        <w:t xml:space="preserve"> application</w:t>
       </w:r>
       <w:r>
         <w:rPr>
@@ -296,7 +350,21 @@
           <w:rFonts w:ascii="Helvetica Neue" w:hAnsi="Helvetica Neue"/>
           <w:color w:val="333333"/>
         </w:rPr>
-        <w:t>• C# • Microsoft.Net framework v4.5 • Microsoft Windows Server Operating System • Microsoft Internet Information Systems (IIS) • HTTP/HTTPS • X509v3 Certificates</w:t>
+        <w:t>• C# • Microsoft.Net framework v4.</w:t>
+      </w:r>
+      <w:r>
+        <w:rPr>
+          <w:rFonts w:ascii="Helvetica Neue" w:hAnsi="Helvetica Neue"/>
+          <w:color w:val="333333"/>
+        </w:rPr>
+        <w:t>8</w:t>
+      </w:r>
+      <w:r>
+        <w:rPr>
+          <w:rFonts w:ascii="Helvetica Neue" w:hAnsi="Helvetica Neue"/>
+          <w:color w:val="333333"/>
+        </w:rPr>
+        <w:t xml:space="preserve"> • Microsoft Windows Server Operating System • Microsoft Internet Information Systems (IIS) • HTTP/HTTPS • X509v3 Certificates</w:t>
       </w:r>
     </w:p>
     <w:p>
@@ -337,7 +405,23 @@
           <w:rFonts w:ascii="Helvetica Neue" w:hAnsi="Helvetica Neue"/>
           <w:color w:val="333333"/>
         </w:rPr>
-        <w:t>The .Net sample web application is based on the open source project OIOSAML.Net</w:t>
+        <w:t xml:space="preserve">The .Net sample web application is based on the </w:t>
+      </w:r>
+      <w:proofErr w:type="gramStart"/>
+      <w:r>
+        <w:rPr>
+          <w:rFonts w:ascii="Helvetica Neue" w:hAnsi="Helvetica Neue"/>
+          <w:color w:val="333333"/>
+        </w:rPr>
+        <w:t>open source</w:t>
+      </w:r>
+      <w:proofErr w:type="gramEnd"/>
+      <w:r>
+        <w:rPr>
+          <w:rFonts w:ascii="Helvetica Neue" w:hAnsi="Helvetica Neue"/>
+          <w:color w:val="333333"/>
+        </w:rPr>
+        <w:t xml:space="preserve"> project OIOSAML.Net</w:t>
       </w:r>
     </w:p>
     <w:p>
@@ -354,7 +438,39 @@
           <w:rFonts w:ascii="Helvetica Neue" w:hAnsi="Helvetica Neue"/>
           <w:color w:val="333333"/>
         </w:rPr>
-        <w:t>The WebsiteDemo in OIOSAML.Net is used to demonstrate how to send a SAML2.0 AuthRequest, how to receive, and how to process a SAML2.0 response containing a SAML2.0 assertion.</w:t>
+        <w:t xml:space="preserve">The </w:t>
+      </w:r>
+      <w:proofErr w:type="spellStart"/>
+      <w:r>
+        <w:rPr>
+          <w:rFonts w:ascii="Helvetica Neue" w:hAnsi="Helvetica Neue"/>
+          <w:color w:val="333333"/>
+        </w:rPr>
+        <w:t>WebsiteDemo</w:t>
+      </w:r>
+      <w:proofErr w:type="spellEnd"/>
+      <w:r>
+        <w:rPr>
+          <w:rFonts w:ascii="Helvetica Neue" w:hAnsi="Helvetica Neue"/>
+          <w:color w:val="333333"/>
+        </w:rPr>
+        <w:t xml:space="preserve"> in OIOSAML.Net is used to demonstrate how to send a SAML2.0 </w:t>
+      </w:r>
+      <w:proofErr w:type="spellStart"/>
+      <w:r>
+        <w:rPr>
+          <w:rFonts w:ascii="Helvetica Neue" w:hAnsi="Helvetica Neue"/>
+          <w:color w:val="333333"/>
+        </w:rPr>
+        <w:t>AuthRequest</w:t>
+      </w:r>
+      <w:proofErr w:type="spellEnd"/>
+      <w:r>
+        <w:rPr>
+          <w:rFonts w:ascii="Helvetica Neue" w:hAnsi="Helvetica Neue"/>
+          <w:color w:val="333333"/>
+        </w:rPr>
+        <w:t>, how to receive, and how to process a SAML2.0 response containing a SAML2.0 assertion.</w:t>
       </w:r>
     </w:p>
     <w:p>
@@ -371,7 +487,32 @@
           <w:rFonts w:ascii="Helvetica Neue" w:hAnsi="Helvetica Neue"/>
           <w:color w:val="333333"/>
         </w:rPr>
-        <w:t>This guide explains how to configure the sample web application (websitedemo) based on a SAML2.0 metadata document from the identity provider with which the sample web application will be used. In this sample, the identity provider is the</w:t>
+        <w:t>This guide explains how to configure the sample web application (</w:t>
+      </w:r>
+      <w:proofErr w:type="spellStart"/>
+      <w:r>
+        <w:rPr>
+          <w:rFonts w:ascii="Helvetica Neue" w:hAnsi="Helvetica Neue"/>
+          <w:color w:val="333333"/>
+        </w:rPr>
+        <w:t>websitedemo</w:t>
+      </w:r>
+      <w:proofErr w:type="spellEnd"/>
+      <w:r>
+        <w:rPr>
+          <w:rFonts w:ascii="Helvetica Neue" w:hAnsi="Helvetica Neue"/>
+          <w:color w:val="333333"/>
+        </w:rPr>
+        <w:t xml:space="preserve">) based on a SAML2.0 metadata document from the identity provider with which the sample web application will be used. In this sample, the identity provider is </w:t>
+      </w:r>
+      <w:proofErr w:type="spellStart"/>
+      <w:proofErr w:type="gramStart"/>
+      <w:r>
+        <w:rPr>
+          <w:rFonts w:ascii="Helvetica Neue" w:hAnsi="Helvetica Neue"/>
+          <w:color w:val="333333"/>
+        </w:rPr>
+        <w:t>the</w:t>
       </w:r>
       <w:r>
         <w:rPr>
@@ -379,7 +520,17 @@
           <w:rFonts w:ascii="Consolas" w:hAnsi="Consolas"/>
           <w:color w:val="333333"/>
         </w:rPr>
-        <w:t>Context Handler</w:t>
+        <w:t>Context</w:t>
+      </w:r>
+      <w:proofErr w:type="spellEnd"/>
+      <w:proofErr w:type="gramEnd"/>
+      <w:r>
+        <w:rPr>
+          <w:rStyle w:val="HTMLCode"/>
+          <w:rFonts w:ascii="Consolas" w:hAnsi="Consolas"/>
+          <w:color w:val="333333"/>
+        </w:rPr>
+        <w:t xml:space="preserve"> Handler</w:t>
       </w:r>
       <w:r>
         <w:rPr>
@@ -404,7 +555,23 @@
           <w:color w:val="333333"/>
         </w:rPr>
         <w:lastRenderedPageBreak/>
-        <w:t>In this guide the metadata-file for the KOMBIT Støttesystemer Context Handler in the project environment is used.</w:t>
+        <w:t xml:space="preserve">In this guide the metadata-file for the KOMBIT </w:t>
+      </w:r>
+      <w:proofErr w:type="spellStart"/>
+      <w:r>
+        <w:rPr>
+          <w:rFonts w:ascii="Helvetica Neue" w:hAnsi="Helvetica Neue"/>
+          <w:color w:val="333333"/>
+        </w:rPr>
+        <w:t>Støttesystemer</w:t>
+      </w:r>
+      <w:proofErr w:type="spellEnd"/>
+      <w:r>
+        <w:rPr>
+          <w:rFonts w:ascii="Helvetica Neue" w:hAnsi="Helvetica Neue"/>
+          <w:color w:val="333333"/>
+        </w:rPr>
+        <w:t xml:space="preserve"> Context Handler in the project environment is used.</w:t>
       </w:r>
     </w:p>
     <w:p>
@@ -447,7 +614,23 @@
           <w:rFonts w:ascii="Helvetica Neue" w:hAnsi="Helvetica Neue"/>
           <w:color w:val="333333"/>
         </w:rPr>
-        <w:t>To use this sample do the following:</w:t>
+        <w:t xml:space="preserve">To use this </w:t>
+      </w:r>
+      <w:proofErr w:type="gramStart"/>
+      <w:r>
+        <w:rPr>
+          <w:rFonts w:ascii="Helvetica Neue" w:hAnsi="Helvetica Neue"/>
+          <w:color w:val="333333"/>
+        </w:rPr>
+        <w:t>sample</w:t>
+      </w:r>
+      <w:proofErr w:type="gramEnd"/>
+      <w:r>
+        <w:rPr>
+          <w:rFonts w:ascii="Helvetica Neue" w:hAnsi="Helvetica Neue"/>
+          <w:color w:val="333333"/>
+        </w:rPr>
+        <w:t xml:space="preserve"> do the following:</w:t>
       </w:r>
     </w:p>
     <w:p>
@@ -1329,16 +1512,7 @@
           <w:rFonts w:ascii="Helvetica Neue" w:hAnsi="Helvetica Neue"/>
           <w:color w:val="333333"/>
         </w:rPr>
-        <w:t>to login usin</w:t>
-      </w:r>
-      <w:bookmarkStart w:id="2" w:name="_GoBack"/>
-      <w:bookmarkEnd w:id="2"/>
-      <w:r>
-        <w:rPr>
-          <w:rFonts w:ascii="Helvetica Neue" w:hAnsi="Helvetica Neue"/>
-          <w:color w:val="333333"/>
-        </w:rPr>
-        <w:t>g the Context Handler.</w:t>
+        <w:t>to login using the Context Handler.</w:t>
       </w:r>
     </w:p>
     <w:p>
@@ -1363,7 +1537,7 @@
 </file>
 
 <file path=word/endnotes.xml><?xml version="1.0" encoding="utf-8"?>
-<w:endnotes xmlns:wpc="http://schemas.microsoft.com/office/word/2010/wordprocessingCanvas" xmlns:mc="http://schemas.openxmlformats.org/markup-compatibility/2006" xmlns:o="urn:schemas-microsoft-com:office:office" xmlns:r="http://schemas.openxmlformats.org/officeDocument/2006/relationships" xmlns:m="http://schemas.openxmlformats.org/officeDocument/2006/math" xmlns:v="urn:schemas-microsoft-com:vml" xmlns:wp14="http://schemas.microsoft.com/office/word/2010/wordprocessingDrawing" xmlns:wp="http://schemas.openxmlformats.org/drawingml/2006/wordprocessingDrawing" xmlns:w10="urn:schemas-microsoft-com:office:word" xmlns:w="http://schemas.openxmlformats.org/wordprocessingml/2006/main" xmlns:w14="http://schemas.microsoft.com/office/word/2010/wordml" xmlns:w15="http://schemas.microsoft.com/office/word/2012/wordml" xmlns:wpg="http://schemas.microsoft.com/office/word/2010/wordprocessingGroup" xmlns:wpi="http://schemas.microsoft.com/office/word/2010/wordprocessingInk" xmlns:wne="http://schemas.microsoft.com/office/word/2006/wordml" xmlns:wps="http://schemas.microsoft.com/office/word/2010/wordprocessingShape" mc:Ignorable="w14 w15 wp14">
+<w:endnotes xmlns:wpc="http://schemas.microsoft.com/office/word/2010/wordprocessingCanvas" xmlns:cx="http://schemas.microsoft.com/office/drawing/2014/chartex" xmlns:cx1="http://schemas.microsoft.com/office/drawing/2015/9/8/chartex" xmlns:cx2="http://schemas.microsoft.com/office/drawing/2015/10/21/chartex" xmlns:cx3="http://schemas.microsoft.com/office/drawing/2016/5/9/chartex" xmlns:cx4="http://schemas.microsoft.com/office/drawing/2016/5/10/chartex" xmlns:cx5="http://schemas.microsoft.com/office/drawing/2016/5/11/chartex" xmlns:cx6="http://schemas.microsoft.com/office/drawing/2016/5/12/chartex" xmlns:cx7="http://schemas.microsoft.com/office/drawing/2016/5/13/chartex" xmlns:cx8="http://schemas.microsoft.com/office/drawing/2016/5/14/chartex" xmlns:mc="http://schemas.openxmlformats.org/markup-compatibility/2006" xmlns:aink="http://schemas.microsoft.com/office/drawing/2016/ink" xmlns:am3d="http://schemas.microsoft.com/office/drawing/2017/model3d" xmlns:o="urn:schemas-microsoft-com:office:office" xmlns:oel="http://schemas.microsoft.com/office/2019/extlst" xmlns:r="http://schemas.openxmlformats.org/officeDocument/2006/relationships" xmlns:m="http://schemas.openxmlformats.org/officeDocument/2006/math" xmlns:v="urn:schemas-microsoft-com:vml" xmlns:wp14="http://schemas.microsoft.com/office/word/2010/wordprocessingDrawing" xmlns:wp="http://schemas.openxmlformats.org/drawingml/2006/wordprocessingDrawing" xmlns:w10="urn:schemas-microsoft-com:office:word" xmlns:w="http://schemas.openxmlformats.org/wordprocessingml/2006/main" xmlns:w14="http://schemas.microsoft.com/office/word/2010/wordml" xmlns:w15="http://schemas.microsoft.com/office/word/2012/wordml" xmlns:w16cex="http://schemas.microsoft.com/office/word/2018/wordml/cex" xmlns:w16cid="http://schemas.microsoft.com/office/word/2016/wordml/cid" xmlns:w16="http://schemas.microsoft.com/office/word/2018/wordml" xmlns:w16du="http://schemas.microsoft.com/office/word/2023/wordml/word16du" xmlns:w16sdtdh="http://schemas.microsoft.com/office/word/2020/wordml/sdtdatahash" xmlns:w16sdtfl="http://schemas.microsoft.com/office/word/2024/wordml/sdtformatlock" xmlns:w16se="http://schemas.microsoft.com/office/word/2015/wordml/symex" xmlns:wpg="http://schemas.microsoft.com/office/word/2010/wordprocessingGroup" xmlns:wpi="http://schemas.microsoft.com/office/word/2010/wordprocessingInk" xmlns:wne="http://schemas.microsoft.com/office/word/2006/wordml" xmlns:wps="http://schemas.microsoft.com/office/word/2010/wordprocessingShape" mc:Ignorable="w14 w15 w16se w16cid w16 w16cex w16sdtdh w16sdtfl w16du wp14">
   <w:endnote w:type="separator" w:id="-1">
     <w:p>
       <w:r>
@@ -1382,7 +1556,7 @@
 </file>
 
 <file path=word/footer1.xml><?xml version="1.0" encoding="utf-8"?>
-<w:ftr xmlns:wpc="http://schemas.microsoft.com/office/word/2010/wordprocessingCanvas" xmlns:mc="http://schemas.openxmlformats.org/markup-compatibility/2006" xmlns:o="urn:schemas-microsoft-com:office:office" xmlns:r="http://schemas.openxmlformats.org/officeDocument/2006/relationships" xmlns:m="http://schemas.openxmlformats.org/officeDocument/2006/math" xmlns:v="urn:schemas-microsoft-com:vml" xmlns:wp14="http://schemas.microsoft.com/office/word/2010/wordprocessingDrawing" xmlns:wp="http://schemas.openxmlformats.org/drawingml/2006/wordprocessingDrawing" xmlns:w10="urn:schemas-microsoft-com:office:word" xmlns:w="http://schemas.openxmlformats.org/wordprocessingml/2006/main" xmlns:w14="http://schemas.microsoft.com/office/word/2010/wordml" xmlns:w15="http://schemas.microsoft.com/office/word/2012/wordml" xmlns:wpg="http://schemas.microsoft.com/office/word/2010/wordprocessingGroup" xmlns:wpi="http://schemas.microsoft.com/office/word/2010/wordprocessingInk" xmlns:wne="http://schemas.microsoft.com/office/word/2006/wordml" xmlns:wps="http://schemas.microsoft.com/office/word/2010/wordprocessingShape" mc:Ignorable="w14 w15 wp14">
+<w:ftr xmlns:wpc="http://schemas.microsoft.com/office/word/2010/wordprocessingCanvas" xmlns:cx="http://schemas.microsoft.com/office/drawing/2014/chartex" xmlns:cx1="http://schemas.microsoft.com/office/drawing/2015/9/8/chartex" xmlns:cx2="http://schemas.microsoft.com/office/drawing/2015/10/21/chartex" xmlns:cx3="http://schemas.microsoft.com/office/drawing/2016/5/9/chartex" xmlns:cx4="http://schemas.microsoft.com/office/drawing/2016/5/10/chartex" xmlns:cx5="http://schemas.microsoft.com/office/drawing/2016/5/11/chartex" xmlns:cx6="http://schemas.microsoft.com/office/drawing/2016/5/12/chartex" xmlns:cx7="http://schemas.microsoft.com/office/drawing/2016/5/13/chartex" xmlns:cx8="http://schemas.microsoft.com/office/drawing/2016/5/14/chartex" xmlns:mc="http://schemas.openxmlformats.org/markup-compatibility/2006" xmlns:aink="http://schemas.microsoft.com/office/drawing/2016/ink" xmlns:am3d="http://schemas.microsoft.com/office/drawing/2017/model3d" xmlns:o="urn:schemas-microsoft-com:office:office" xmlns:oel="http://schemas.microsoft.com/office/2019/extlst" xmlns:r="http://schemas.openxmlformats.org/officeDocument/2006/relationships" xmlns:m="http://schemas.openxmlformats.org/officeDocument/2006/math" xmlns:v="urn:schemas-microsoft-com:vml" xmlns:wp14="http://schemas.microsoft.com/office/word/2010/wordprocessingDrawing" xmlns:wp="http://schemas.openxmlformats.org/drawingml/2006/wordprocessingDrawing" xmlns:w10="urn:schemas-microsoft-com:office:word" xmlns:w="http://schemas.openxmlformats.org/wordprocessingml/2006/main" xmlns:w14="http://schemas.microsoft.com/office/word/2010/wordml" xmlns:w15="http://schemas.microsoft.com/office/word/2012/wordml" xmlns:w16cex="http://schemas.microsoft.com/office/word/2018/wordml/cex" xmlns:w16cid="http://schemas.microsoft.com/office/word/2016/wordml/cid" xmlns:w16="http://schemas.microsoft.com/office/word/2018/wordml" xmlns:w16du="http://schemas.microsoft.com/office/word/2023/wordml/word16du" xmlns:w16sdtdh="http://schemas.microsoft.com/office/word/2020/wordml/sdtdatahash" xmlns:w16sdtfl="http://schemas.microsoft.com/office/word/2024/wordml/sdtformatlock" xmlns:w16se="http://schemas.microsoft.com/office/word/2015/wordml/symex" xmlns:wpg="http://schemas.microsoft.com/office/word/2010/wordprocessingGroup" xmlns:wpi="http://schemas.microsoft.com/office/word/2010/wordprocessingInk" xmlns:wne="http://schemas.microsoft.com/office/word/2006/wordml" xmlns:wps="http://schemas.microsoft.com/office/word/2010/wordprocessingShape" mc:Ignorable="w14 w15 w16se w16cid w16 w16cex w16sdtdh w16sdtfl w16du wp14">
   <w:p>
     <w:pPr>
       <w:pStyle w:val="Footer"/>
@@ -1408,7 +1582,14 @@
         <w:sz w:val="16"/>
         <w:szCs w:val="16"/>
       </w:rPr>
-      <w:t xml:space="preserve">Globeteam A/S · </w:t>
+      <w:t xml:space="preserve">Globeteam </w:t>
+    </w:r>
+    <w:r>
+      <w:rPr>
+        <w:sz w:val="16"/>
+        <w:szCs w:val="16"/>
+      </w:rPr>
+      <w:t xml:space="preserve">A/S · </w:t>
     </w:r>
     <w:r>
       <w:rPr>
@@ -1575,7 +1756,7 @@
 </file>
 
 <file path=word/footnotes.xml><?xml version="1.0" encoding="utf-8"?>
-<w:footnotes xmlns:wpc="http://schemas.microsoft.com/office/word/2010/wordprocessingCanvas" xmlns:mc="http://schemas.openxmlformats.org/markup-compatibility/2006" xmlns:o="urn:schemas-microsoft-com:office:office" xmlns:r="http://schemas.openxmlformats.org/officeDocument/2006/relationships" xmlns:m="http://schemas.openxmlformats.org/officeDocument/2006/math" xmlns:v="urn:schemas-microsoft-com:vml" xmlns:wp14="http://schemas.microsoft.com/office/word/2010/wordprocessingDrawing" xmlns:wp="http://schemas.openxmlformats.org/drawingml/2006/wordprocessingDrawing" xmlns:w10="urn:schemas-microsoft-com:office:word" xmlns:w="http://schemas.openxmlformats.org/wordprocessingml/2006/main" xmlns:w14="http://schemas.microsoft.com/office/word/2010/wordml" xmlns:w15="http://schemas.microsoft.com/office/word/2012/wordml" xmlns:wpg="http://schemas.microsoft.com/office/word/2010/wordprocessingGroup" xmlns:wpi="http://schemas.microsoft.com/office/word/2010/wordprocessingInk" xmlns:wne="http://schemas.microsoft.com/office/word/2006/wordml" xmlns:wps="http://schemas.microsoft.com/office/word/2010/wordprocessingShape" mc:Ignorable="w14 w15 wp14">
+<w:footnotes xmlns:wpc="http://schemas.microsoft.com/office/word/2010/wordprocessingCanvas" xmlns:cx="http://schemas.microsoft.com/office/drawing/2014/chartex" xmlns:cx1="http://schemas.microsoft.com/office/drawing/2015/9/8/chartex" xmlns:cx2="http://schemas.microsoft.com/office/drawing/2015/10/21/chartex" xmlns:cx3="http://schemas.microsoft.com/office/drawing/2016/5/9/chartex" xmlns:cx4="http://schemas.microsoft.com/office/drawing/2016/5/10/chartex" xmlns:cx5="http://schemas.microsoft.com/office/drawing/2016/5/11/chartex" xmlns:cx6="http://schemas.microsoft.com/office/drawing/2016/5/12/chartex" xmlns:cx7="http://schemas.microsoft.com/office/drawing/2016/5/13/chartex" xmlns:cx8="http://schemas.microsoft.com/office/drawing/2016/5/14/chartex" xmlns:mc="http://schemas.openxmlformats.org/markup-compatibility/2006" xmlns:aink="http://schemas.microsoft.com/office/drawing/2016/ink" xmlns:am3d="http://schemas.microsoft.com/office/drawing/2017/model3d" xmlns:o="urn:schemas-microsoft-com:office:office" xmlns:oel="http://schemas.microsoft.com/office/2019/extlst" xmlns:r="http://schemas.openxmlformats.org/officeDocument/2006/relationships" xmlns:m="http://schemas.openxmlformats.org/officeDocument/2006/math" xmlns:v="urn:schemas-microsoft-com:vml" xmlns:wp14="http://schemas.microsoft.com/office/word/2010/wordprocessingDrawing" xmlns:wp="http://schemas.openxmlformats.org/drawingml/2006/wordprocessingDrawing" xmlns:w10="urn:schemas-microsoft-com:office:word" xmlns:w="http://schemas.openxmlformats.org/wordprocessingml/2006/main" xmlns:w14="http://schemas.microsoft.com/office/word/2010/wordml" xmlns:w15="http://schemas.microsoft.com/office/word/2012/wordml" xmlns:w16cex="http://schemas.microsoft.com/office/word/2018/wordml/cex" xmlns:w16cid="http://schemas.microsoft.com/office/word/2016/wordml/cid" xmlns:w16="http://schemas.microsoft.com/office/word/2018/wordml" xmlns:w16du="http://schemas.microsoft.com/office/word/2023/wordml/word16du" xmlns:w16sdtdh="http://schemas.microsoft.com/office/word/2020/wordml/sdtdatahash" xmlns:w16sdtfl="http://schemas.microsoft.com/office/word/2024/wordml/sdtformatlock" xmlns:w16se="http://schemas.microsoft.com/office/word/2015/wordml/symex" xmlns:wpg="http://schemas.microsoft.com/office/word/2010/wordprocessingGroup" xmlns:wpi="http://schemas.microsoft.com/office/word/2010/wordprocessingInk" xmlns:wne="http://schemas.microsoft.com/office/word/2006/wordml" xmlns:wps="http://schemas.microsoft.com/office/word/2010/wordprocessingShape" mc:Ignorable="w14 w15 w16se w16cid w16 w16cex w16sdtdh w16sdtfl w16du wp14">
   <w:footnote w:type="separator" w:id="-1">
     <w:p>
       <w:r>
@@ -1594,7 +1775,7 @@
 </file>
 
 <file path=word/header1.xml><?xml version="1.0" encoding="utf-8"?>
-<w:hdr xmlns:wpc="http://schemas.microsoft.com/office/word/2010/wordprocessingCanvas" xmlns:mc="http://schemas.openxmlformats.org/markup-compatibility/2006" xmlns:o="urn:schemas-microsoft-com:office:office" xmlns:r="http://schemas.openxmlformats.org/officeDocument/2006/relationships" xmlns:m="http://schemas.openxmlformats.org/officeDocument/2006/math" xmlns:v="urn:schemas-microsoft-com:vml" xmlns:wp14="http://schemas.microsoft.com/office/word/2010/wordprocessingDrawing" xmlns:wp="http://schemas.openxmlformats.org/drawingml/2006/wordprocessingDrawing" xmlns:w10="urn:schemas-microsoft-com:office:word" xmlns:w="http://schemas.openxmlformats.org/wordprocessingml/2006/main" xmlns:w14="http://schemas.microsoft.com/office/word/2010/wordml" xmlns:w15="http://schemas.microsoft.com/office/word/2012/wordml" xmlns:wpg="http://schemas.microsoft.com/office/word/2010/wordprocessingGroup" xmlns:wpi="http://schemas.microsoft.com/office/word/2010/wordprocessingInk" xmlns:wne="http://schemas.microsoft.com/office/word/2006/wordml" xmlns:wps="http://schemas.microsoft.com/office/word/2010/wordprocessingShape" mc:Ignorable="w14 w15 wp14">
+<w:hdr xmlns:wpc="http://schemas.microsoft.com/office/word/2010/wordprocessingCanvas" xmlns:cx="http://schemas.microsoft.com/office/drawing/2014/chartex" xmlns:cx1="http://schemas.microsoft.com/office/drawing/2015/9/8/chartex" xmlns:cx2="http://schemas.microsoft.com/office/drawing/2015/10/21/chartex" xmlns:cx3="http://schemas.microsoft.com/office/drawing/2016/5/9/chartex" xmlns:cx4="http://schemas.microsoft.com/office/drawing/2016/5/10/chartex" xmlns:cx5="http://schemas.microsoft.com/office/drawing/2016/5/11/chartex" xmlns:cx6="http://schemas.microsoft.com/office/drawing/2016/5/12/chartex" xmlns:cx7="http://schemas.microsoft.com/office/drawing/2016/5/13/chartex" xmlns:cx8="http://schemas.microsoft.com/office/drawing/2016/5/14/chartex" xmlns:mc="http://schemas.openxmlformats.org/markup-compatibility/2006" xmlns:aink="http://schemas.microsoft.com/office/drawing/2016/ink" xmlns:am3d="http://schemas.microsoft.com/office/drawing/2017/model3d" xmlns:o="urn:schemas-microsoft-com:office:office" xmlns:oel="http://schemas.microsoft.com/office/2019/extlst" xmlns:r="http://schemas.openxmlformats.org/officeDocument/2006/relationships" xmlns:m="http://schemas.openxmlformats.org/officeDocument/2006/math" xmlns:v="urn:schemas-microsoft-com:vml" xmlns:wp14="http://schemas.microsoft.com/office/word/2010/wordprocessingDrawing" xmlns:wp="http://schemas.openxmlformats.org/drawingml/2006/wordprocessingDrawing" xmlns:w10="urn:schemas-microsoft-com:office:word" xmlns:w="http://schemas.openxmlformats.org/wordprocessingml/2006/main" xmlns:w14="http://schemas.microsoft.com/office/word/2010/wordml" xmlns:w15="http://schemas.microsoft.com/office/word/2012/wordml" xmlns:w16cex="http://schemas.microsoft.com/office/word/2018/wordml/cex" xmlns:w16cid="http://schemas.microsoft.com/office/word/2016/wordml/cid" xmlns:w16="http://schemas.microsoft.com/office/word/2018/wordml" xmlns:w16du="http://schemas.microsoft.com/office/word/2023/wordml/word16du" xmlns:w16sdtdh="http://schemas.microsoft.com/office/word/2020/wordml/sdtdatahash" xmlns:w16sdtfl="http://schemas.microsoft.com/office/word/2024/wordml/sdtformatlock" xmlns:w16se="http://schemas.microsoft.com/office/word/2015/wordml/symex" xmlns:wpg="http://schemas.microsoft.com/office/word/2010/wordprocessingGroup" xmlns:wpi="http://schemas.microsoft.com/office/word/2010/wordprocessingInk" xmlns:wne="http://schemas.microsoft.com/office/word/2006/wordml" xmlns:wps="http://schemas.microsoft.com/office/word/2010/wordprocessingShape" mc:Ignorable="w14 w15 w16se w16cid w16 w16cex w16sdtdh w16sdtfl w16du wp14">
   <w:p>
     <w:pPr>
       <w:pStyle w:val="Header"/>
@@ -1628,7 +1809,7 @@
           </v:handles>
           <o:lock v:ext="edit" text="t" shapetype="t"/>
         </v:shapetype>
-        <v:shape id="PowerPlusWaterMarkObject3511099" o:spid="_x0000_s2107" type="#_x0000_t136" style="position:absolute;margin-left:0;margin-top:0;width:274pt;height:109.6pt;rotation:315;z-index:-251648512;mso-position-horizontal:center;mso-position-horizontal-relative:margin;mso-position-vertical:center;mso-position-vertical-relative:margin" o:allowincell="f" fillcolor="silver" stroked="f">
+        <v:shape id="PowerPlusWaterMarkObject3511099" o:spid="_x0000_s1083" type="#_x0000_t136" style="position:absolute;margin-left:0;margin-top:0;width:274pt;height:109.6pt;rotation:315;z-index:-251648512;mso-position-horizontal:center;mso-position-horizontal-relative:margin;mso-position-vertical:center;mso-position-vertical-relative:margin" o:allowincell="f" fillcolor="silver" stroked="f">
           <v:fill opacity=".5"/>
           <v:textpath style="font-family:&quot;Arial&quot;;font-size:1pt" string="DRAFT"/>
           <w10:wrap anchorx="margin" anchory="margin"/>
@@ -1640,7 +1821,7 @@
 </file>
 
 <file path=word/header2.xml><?xml version="1.0" encoding="utf-8"?>
-<w:hdr xmlns:wpc="http://schemas.microsoft.com/office/word/2010/wordprocessingCanvas" xmlns:mc="http://schemas.openxmlformats.org/markup-compatibility/2006" xmlns:o="urn:schemas-microsoft-com:office:office" xmlns:r="http://schemas.openxmlformats.org/officeDocument/2006/relationships" xmlns:m="http://schemas.openxmlformats.org/officeDocument/2006/math" xmlns:v="urn:schemas-microsoft-com:vml" xmlns:wp14="http://schemas.microsoft.com/office/word/2010/wordprocessingDrawing" xmlns:wp="http://schemas.openxmlformats.org/drawingml/2006/wordprocessingDrawing" xmlns:w10="urn:schemas-microsoft-com:office:word" xmlns:w="http://schemas.openxmlformats.org/wordprocessingml/2006/main" xmlns:w14="http://schemas.microsoft.com/office/word/2010/wordml" xmlns:w15="http://schemas.microsoft.com/office/word/2012/wordml" xmlns:wpg="http://schemas.microsoft.com/office/word/2010/wordprocessingGroup" xmlns:wpi="http://schemas.microsoft.com/office/word/2010/wordprocessingInk" xmlns:wne="http://schemas.microsoft.com/office/word/2006/wordml" xmlns:wps="http://schemas.microsoft.com/office/word/2010/wordprocessingShape" mc:Ignorable="w14 w15 wp14">
+<w:hdr xmlns:wpc="http://schemas.microsoft.com/office/word/2010/wordprocessingCanvas" xmlns:cx="http://schemas.microsoft.com/office/drawing/2014/chartex" xmlns:cx1="http://schemas.microsoft.com/office/drawing/2015/9/8/chartex" xmlns:cx2="http://schemas.microsoft.com/office/drawing/2015/10/21/chartex" xmlns:cx3="http://schemas.microsoft.com/office/drawing/2016/5/9/chartex" xmlns:cx4="http://schemas.microsoft.com/office/drawing/2016/5/10/chartex" xmlns:cx5="http://schemas.microsoft.com/office/drawing/2016/5/11/chartex" xmlns:cx6="http://schemas.microsoft.com/office/drawing/2016/5/12/chartex" xmlns:cx7="http://schemas.microsoft.com/office/drawing/2016/5/13/chartex" xmlns:cx8="http://schemas.microsoft.com/office/drawing/2016/5/14/chartex" xmlns:mc="http://schemas.openxmlformats.org/markup-compatibility/2006" xmlns:aink="http://schemas.microsoft.com/office/drawing/2016/ink" xmlns:am3d="http://schemas.microsoft.com/office/drawing/2017/model3d" xmlns:o="urn:schemas-microsoft-com:office:office" xmlns:oel="http://schemas.microsoft.com/office/2019/extlst" xmlns:r="http://schemas.openxmlformats.org/officeDocument/2006/relationships" xmlns:m="http://schemas.openxmlformats.org/officeDocument/2006/math" xmlns:v="urn:schemas-microsoft-com:vml" xmlns:wp14="http://schemas.microsoft.com/office/word/2010/wordprocessingDrawing" xmlns:wp="http://schemas.openxmlformats.org/drawingml/2006/wordprocessingDrawing" xmlns:w10="urn:schemas-microsoft-com:office:word" xmlns:w="http://schemas.openxmlformats.org/wordprocessingml/2006/main" xmlns:w14="http://schemas.microsoft.com/office/word/2010/wordml" xmlns:w15="http://schemas.microsoft.com/office/word/2012/wordml" xmlns:w16cex="http://schemas.microsoft.com/office/word/2018/wordml/cex" xmlns:w16cid="http://schemas.microsoft.com/office/word/2016/wordml/cid" xmlns:w16="http://schemas.microsoft.com/office/word/2018/wordml" xmlns:w16du="http://schemas.microsoft.com/office/word/2023/wordml/word16du" xmlns:w16sdtdh="http://schemas.microsoft.com/office/word/2020/wordml/sdtdatahash" xmlns:w16sdtfl="http://schemas.microsoft.com/office/word/2024/wordml/sdtformatlock" xmlns:w16se="http://schemas.microsoft.com/office/word/2015/wordml/symex" xmlns:wpg="http://schemas.microsoft.com/office/word/2010/wordprocessingGroup" xmlns:wpi="http://schemas.microsoft.com/office/word/2010/wordprocessingInk" xmlns:wne="http://schemas.microsoft.com/office/word/2006/wordml" xmlns:wps="http://schemas.microsoft.com/office/word/2010/wordprocessingShape" mc:Ignorable="w14 w15 w16se w16cid w16 w16cex w16sdtdh w16sdtfl w16du wp14">
   <w:p>
     <w:pPr>
       <w:pStyle w:val="GlobeteamNavnetrk"/>
@@ -1680,7 +1861,7 @@
           </v:handles>
           <o:lock v:ext="edit" text="t" shapetype="t"/>
         </v:shapetype>
-        <v:shape id="PowerPlusWaterMarkObject3511100" o:spid="_x0000_s2108" type="#_x0000_t136" style="position:absolute;left:0;text-align:left;margin-left:0;margin-top:0;width:274pt;height:109.6pt;rotation:315;z-index:-251647488;mso-position-horizontal:center;mso-position-horizontal-relative:margin;mso-position-vertical:center;mso-position-vertical-relative:margin" o:allowincell="f" fillcolor="silver" stroked="f">
+        <v:shape id="PowerPlusWaterMarkObject3511100" o:spid="_x0000_s1084" type="#_x0000_t136" style="position:absolute;left:0;text-align:left;margin-left:0;margin-top:0;width:274pt;height:109.6pt;rotation:315;z-index:-251647488;mso-position-horizontal:center;mso-position-horizontal-relative:margin;mso-position-vertical:center;mso-position-vertical-relative:margin" o:allowincell="f" fillcolor="silver" stroked="f">
           <v:fill opacity=".5"/>
           <v:textpath style="font-family:&quot;Arial&quot;;font-size:1pt" string="DRAFT"/>
           <w10:wrap anchorx="margin" anchory="margin"/>
@@ -1698,7 +1879,7 @@
           <v:stroke joinstyle="miter"/>
           <v:path gradientshapeok="t" o:connecttype="rect"/>
         </v:shapetype>
-        <v:shape id="Text box 40" o:spid="_x0000_s2092" type="#_x0000_t202" style="position:absolute;left:0;text-align:left;margin-left:14.2pt;margin-top:53pt;width:320.9pt;height:5.65pt;z-index:251655680;visibility:visible;mso-position-horizontal-relative:page;mso-position-vertical-relative:page" fillcolor="#6579ae" stroked="f">
+        <v:shape id="Text box 40" o:spid="_x0000_s1068" type="#_x0000_t202" style="position:absolute;left:0;text-align:left;margin-left:14.2pt;margin-top:53pt;width:320.9pt;height:5.65pt;z-index:251655680;visibility:visible;mso-position-horizontal-relative:page;mso-position-vertical-relative:page" fillcolor="#6579ae" stroked="f">
           <v:textbox style="mso-next-textbox:#Text box 40">
             <w:txbxContent>
               <w:p/>
@@ -1796,7 +1977,7 @@
 </file>
 
 <file path=word/header3.xml><?xml version="1.0" encoding="utf-8"?>
-<w:hdr xmlns:wpc="http://schemas.microsoft.com/office/word/2010/wordprocessingCanvas" xmlns:mc="http://schemas.openxmlformats.org/markup-compatibility/2006" xmlns:o="urn:schemas-microsoft-com:office:office" xmlns:r="http://schemas.openxmlformats.org/officeDocument/2006/relationships" xmlns:m="http://schemas.openxmlformats.org/officeDocument/2006/math" xmlns:v="urn:schemas-microsoft-com:vml" xmlns:wp14="http://schemas.microsoft.com/office/word/2010/wordprocessingDrawing" xmlns:wp="http://schemas.openxmlformats.org/drawingml/2006/wordprocessingDrawing" xmlns:w10="urn:schemas-microsoft-com:office:word" xmlns:w="http://schemas.openxmlformats.org/wordprocessingml/2006/main" xmlns:w14="http://schemas.microsoft.com/office/word/2010/wordml" xmlns:w15="http://schemas.microsoft.com/office/word/2012/wordml" xmlns:wpg="http://schemas.microsoft.com/office/word/2010/wordprocessingGroup" xmlns:wpi="http://schemas.microsoft.com/office/word/2010/wordprocessingInk" xmlns:wne="http://schemas.microsoft.com/office/word/2006/wordml" xmlns:wps="http://schemas.microsoft.com/office/word/2010/wordprocessingShape" mc:Ignorable="w14 w15 wp14">
+<w:hdr xmlns:wpc="http://schemas.microsoft.com/office/word/2010/wordprocessingCanvas" xmlns:cx="http://schemas.microsoft.com/office/drawing/2014/chartex" xmlns:cx1="http://schemas.microsoft.com/office/drawing/2015/9/8/chartex" xmlns:cx2="http://schemas.microsoft.com/office/drawing/2015/10/21/chartex" xmlns:cx3="http://schemas.microsoft.com/office/drawing/2016/5/9/chartex" xmlns:cx4="http://schemas.microsoft.com/office/drawing/2016/5/10/chartex" xmlns:cx5="http://schemas.microsoft.com/office/drawing/2016/5/11/chartex" xmlns:cx6="http://schemas.microsoft.com/office/drawing/2016/5/12/chartex" xmlns:cx7="http://schemas.microsoft.com/office/drawing/2016/5/13/chartex" xmlns:cx8="http://schemas.microsoft.com/office/drawing/2016/5/14/chartex" xmlns:mc="http://schemas.openxmlformats.org/markup-compatibility/2006" xmlns:aink="http://schemas.microsoft.com/office/drawing/2016/ink" xmlns:am3d="http://schemas.microsoft.com/office/drawing/2017/model3d" xmlns:o="urn:schemas-microsoft-com:office:office" xmlns:oel="http://schemas.microsoft.com/office/2019/extlst" xmlns:r="http://schemas.openxmlformats.org/officeDocument/2006/relationships" xmlns:m="http://schemas.openxmlformats.org/officeDocument/2006/math" xmlns:v="urn:schemas-microsoft-com:vml" xmlns:wp14="http://schemas.microsoft.com/office/word/2010/wordprocessingDrawing" xmlns:wp="http://schemas.openxmlformats.org/drawingml/2006/wordprocessingDrawing" xmlns:w10="urn:schemas-microsoft-com:office:word" xmlns:w="http://schemas.openxmlformats.org/wordprocessingml/2006/main" xmlns:w14="http://schemas.microsoft.com/office/word/2010/wordml" xmlns:w15="http://schemas.microsoft.com/office/word/2012/wordml" xmlns:w16cex="http://schemas.microsoft.com/office/word/2018/wordml/cex" xmlns:w16cid="http://schemas.microsoft.com/office/word/2016/wordml/cid" xmlns:w16="http://schemas.microsoft.com/office/word/2018/wordml" xmlns:w16du="http://schemas.microsoft.com/office/word/2023/wordml/word16du" xmlns:w16sdtdh="http://schemas.microsoft.com/office/word/2020/wordml/sdtdatahash" xmlns:w16sdtfl="http://schemas.microsoft.com/office/word/2024/wordml/sdtformatlock" xmlns:w16se="http://schemas.microsoft.com/office/word/2015/wordml/symex" xmlns:wpg="http://schemas.microsoft.com/office/word/2010/wordprocessingGroup" xmlns:wpi="http://schemas.microsoft.com/office/word/2010/wordprocessingInk" xmlns:wne="http://schemas.microsoft.com/office/word/2006/wordml" xmlns:wps="http://schemas.microsoft.com/office/word/2010/wordprocessingShape" mc:Ignorable="w14 w15 w16se w16cid w16 w16cex w16sdtdh w16sdtfl w16du wp14">
   <w:p>
     <w:pPr>
       <w:pStyle w:val="Header"/>
@@ -1830,7 +2011,7 @@
           </v:handles>
           <o:lock v:ext="edit" text="t" shapetype="t"/>
         </v:shapetype>
-        <v:shape id="PowerPlusWaterMarkObject3511098" o:spid="_x0000_s2106" type="#_x0000_t136" style="position:absolute;margin-left:0;margin-top:0;width:274pt;height:109.6pt;rotation:315;z-index:-251649536;mso-position-horizontal:center;mso-position-horizontal-relative:margin;mso-position-vertical:center;mso-position-vertical-relative:margin" o:allowincell="f" fillcolor="silver" stroked="f">
+        <v:shape id="PowerPlusWaterMarkObject3511098" o:spid="_x0000_s1082" type="#_x0000_t136" style="position:absolute;margin-left:0;margin-top:0;width:274pt;height:109.6pt;rotation:315;z-index:-251649536;mso-position-horizontal:center;mso-position-horizontal-relative:margin;mso-position-vertical:center;mso-position-vertical-relative:margin" o:allowincell="f" fillcolor="silver" stroked="f">
           <v:fill opacity=".5"/>
           <v:textpath style="font-family:&quot;Arial&quot;;font-size:1pt" string="DRAFT"/>
           <w10:wrap anchorx="margin" anchory="margin"/>
@@ -2429,7 +2610,7 @@
           <v:stroke joinstyle="miter"/>
           <v:path gradientshapeok="t" o:connecttype="rect"/>
         </v:shapetype>
-        <v:shape id="Tekstboks: GLOBETEAM" o:spid="_x0000_s2084" type="#_x0000_t202" style="position:absolute;margin-left:0;margin-top:161.3pt;width:4in;height:17.85pt;z-index:251652608;visibility:visible;mso-position-horizontal-relative:text;mso-position-vertical-relative:text" filled="f" stroked="f">
+        <v:shape id="Tekstboks: GLOBETEAM" o:spid="_x0000_s1060" type="#_x0000_t202" style="position:absolute;margin-left:0;margin-top:161.3pt;width:4in;height:17.85pt;z-index:251652608;visibility:visible;mso-position-horizontal-relative:text;mso-position-vertical-relative:text" filled="f" stroked="f">
           <v:textbox style="mso-next-textbox:#Tekstboks: GLOBETEAM" inset="0,0,0,0">
             <w:txbxContent>
               <w:p>
@@ -2451,8 +2632,8 @@
         <w:noProof/>
       </w:rPr>
       <w:pict w14:anchorId="37B73921">
-        <v:shape id="_x0000_s2083" type="#_x0000_t202" style="position:absolute;margin-left:266.5pt;margin-top:289.15pt;width:291.95pt;height:14.15pt;z-index:251651584;visibility:visible;mso-position-horizontal-relative:page;mso-position-vertical-relative:page" fillcolor="#6579ae" stroked="f">
-          <v:textbox style="mso-next-textbox:#_x0000_s2083">
+        <v:shape id="_x0000_s1059" type="#_x0000_t202" style="position:absolute;margin-left:266.5pt;margin-top:289.15pt;width:291.95pt;height:14.15pt;z-index:251651584;visibility:visible;mso-position-horizontal-relative:page;mso-position-vertical-relative:page" fillcolor="#6579ae" stroked="f">
+          <v:textbox style="mso-next-textbox:#_x0000_s1059">
             <w:txbxContent>
               <w:p>
                 <w:pPr>
@@ -2472,8 +2653,8 @@
         <w:noProof/>
       </w:rPr>
       <w:pict w14:anchorId="0B177212">
-        <v:shape id="_x0000_s2082" type="#_x0000_t202" style="position:absolute;margin-left:266.5pt;margin-top:416.75pt;width:291.95pt;height:34pt;z-index:251650560;visibility:visible;mso-position-horizontal-relative:page;mso-position-vertical-relative:page" fillcolor="#6579ae" stroked="f">
-          <v:textbox style="mso-next-textbox:#_x0000_s2082">
+        <v:shape id="_x0000_s1058" type="#_x0000_t202" style="position:absolute;margin-left:266.5pt;margin-top:416.75pt;width:291.95pt;height:34pt;z-index:251650560;visibility:visible;mso-position-horizontal-relative:page;mso-position-vertical-relative:page" fillcolor="#6579ae" stroked="f">
+          <v:textbox style="mso-next-textbox:#_x0000_s1058">
             <w:txbxContent>
               <w:p>
                 <w:pPr>
@@ -2493,8 +2674,8 @@
         <w:noProof/>
       </w:rPr>
       <w:pict w14:anchorId="1D7FD02B">
-        <v:shape id="_x0000_s2081" type="#_x0000_t202" style="position:absolute;margin-left:266.5pt;margin-top:345.85pt;width:291.95pt;height:22.7pt;z-index:251649536;visibility:visible;mso-position-horizontal-relative:page;mso-position-vertical-relative:page" fillcolor="#6579ae" stroked="f">
-          <v:textbox style="mso-next-textbox:#_x0000_s2081">
+        <v:shape id="_x0000_s1057" type="#_x0000_t202" style="position:absolute;margin-left:266.5pt;margin-top:345.85pt;width:291.95pt;height:22.7pt;z-index:251649536;visibility:visible;mso-position-horizontal-relative:page;mso-position-vertical-relative:page" fillcolor="#6579ae" stroked="f">
+          <v:textbox style="mso-next-textbox:#_x0000_s1057">
             <w:txbxContent>
               <w:p>
                 <w:pPr>
@@ -2514,8 +2695,8 @@
         <w:noProof/>
       </w:rPr>
       <w:pict w14:anchorId="4B61BADE">
-        <v:shape id="_x0000_s2080" type="#_x0000_t202" style="position:absolute;margin-left:266.5pt;margin-top:214.05pt;width:291.95pt;height:8.5pt;z-index:251648512;visibility:visible;mso-position-horizontal-relative:page;mso-position-vertical-relative:page" fillcolor="#6579ae" stroked="f">
-          <v:textbox style="mso-next-textbox:#_x0000_s2080">
+        <v:shape id="_x0000_s1056" type="#_x0000_t202" style="position:absolute;margin-left:266.5pt;margin-top:214.05pt;width:291.95pt;height:8.5pt;z-index:251648512;visibility:visible;mso-position-horizontal-relative:page;mso-position-vertical-relative:page" fillcolor="#6579ae" stroked="f">
+          <v:textbox style="mso-next-textbox:#_x0000_s1056">
             <w:txbxContent>
               <w:p>
                 <w:pPr>
@@ -2535,7 +2716,7 @@
 </file>
 
 <file path=word/header4.xml><?xml version="1.0" encoding="utf-8"?>
-<w:hdr xmlns:wpc="http://schemas.microsoft.com/office/word/2010/wordprocessingCanvas" xmlns:mc="http://schemas.openxmlformats.org/markup-compatibility/2006" xmlns:o="urn:schemas-microsoft-com:office:office" xmlns:r="http://schemas.openxmlformats.org/officeDocument/2006/relationships" xmlns:m="http://schemas.openxmlformats.org/officeDocument/2006/math" xmlns:v="urn:schemas-microsoft-com:vml" xmlns:wp14="http://schemas.microsoft.com/office/word/2010/wordprocessingDrawing" xmlns:wp="http://schemas.openxmlformats.org/drawingml/2006/wordprocessingDrawing" xmlns:w10="urn:schemas-microsoft-com:office:word" xmlns:w="http://schemas.openxmlformats.org/wordprocessingml/2006/main" xmlns:w14="http://schemas.microsoft.com/office/word/2010/wordml" xmlns:w15="http://schemas.microsoft.com/office/word/2012/wordml" xmlns:wpg="http://schemas.microsoft.com/office/word/2010/wordprocessingGroup" xmlns:wpi="http://schemas.microsoft.com/office/word/2010/wordprocessingInk" xmlns:wne="http://schemas.microsoft.com/office/word/2006/wordml" xmlns:wps="http://schemas.microsoft.com/office/word/2010/wordprocessingShape" mc:Ignorable="w14 w15 wp14">
+<w:hdr xmlns:wpc="http://schemas.microsoft.com/office/word/2010/wordprocessingCanvas" xmlns:cx="http://schemas.microsoft.com/office/drawing/2014/chartex" xmlns:cx1="http://schemas.microsoft.com/office/drawing/2015/9/8/chartex" xmlns:cx2="http://schemas.microsoft.com/office/drawing/2015/10/21/chartex" xmlns:cx3="http://schemas.microsoft.com/office/drawing/2016/5/9/chartex" xmlns:cx4="http://schemas.microsoft.com/office/drawing/2016/5/10/chartex" xmlns:cx5="http://schemas.microsoft.com/office/drawing/2016/5/11/chartex" xmlns:cx6="http://schemas.microsoft.com/office/drawing/2016/5/12/chartex" xmlns:cx7="http://schemas.microsoft.com/office/drawing/2016/5/13/chartex" xmlns:cx8="http://schemas.microsoft.com/office/drawing/2016/5/14/chartex" xmlns:mc="http://schemas.openxmlformats.org/markup-compatibility/2006" xmlns:aink="http://schemas.microsoft.com/office/drawing/2016/ink" xmlns:am3d="http://schemas.microsoft.com/office/drawing/2017/model3d" xmlns:o="urn:schemas-microsoft-com:office:office" xmlns:oel="http://schemas.microsoft.com/office/2019/extlst" xmlns:r="http://schemas.openxmlformats.org/officeDocument/2006/relationships" xmlns:m="http://schemas.openxmlformats.org/officeDocument/2006/math" xmlns:v="urn:schemas-microsoft-com:vml" xmlns:wp14="http://schemas.microsoft.com/office/word/2010/wordprocessingDrawing" xmlns:wp="http://schemas.openxmlformats.org/drawingml/2006/wordprocessingDrawing" xmlns:w10="urn:schemas-microsoft-com:office:word" xmlns:w="http://schemas.openxmlformats.org/wordprocessingml/2006/main" xmlns:w14="http://schemas.microsoft.com/office/word/2010/wordml" xmlns:w15="http://schemas.microsoft.com/office/word/2012/wordml" xmlns:w16cex="http://schemas.microsoft.com/office/word/2018/wordml/cex" xmlns:w16cid="http://schemas.microsoft.com/office/word/2016/wordml/cid" xmlns:w16="http://schemas.microsoft.com/office/word/2018/wordml" xmlns:w16du="http://schemas.microsoft.com/office/word/2023/wordml/word16du" xmlns:w16sdtdh="http://schemas.microsoft.com/office/word/2020/wordml/sdtdatahash" xmlns:w16sdtfl="http://schemas.microsoft.com/office/word/2024/wordml/sdtformatlock" xmlns:w16se="http://schemas.microsoft.com/office/word/2015/wordml/symex" xmlns:wpg="http://schemas.microsoft.com/office/word/2010/wordprocessingGroup" xmlns:wpi="http://schemas.microsoft.com/office/word/2010/wordprocessingInk" xmlns:wne="http://schemas.microsoft.com/office/word/2006/wordml" xmlns:wps="http://schemas.microsoft.com/office/word/2010/wordprocessingShape" mc:Ignorable="w14 w15 w16se w16cid w16 w16cex w16sdtdh w16sdtfl w16du wp14">
   <w:p>
     <w:pPr>
       <w:pStyle w:val="Header"/>
@@ -2569,7 +2750,7 @@
           </v:handles>
           <o:lock v:ext="edit" text="t" shapetype="t"/>
         </v:shapetype>
-        <v:shape id="PowerPlusWaterMarkObject3511102" o:spid="_x0000_s2110" type="#_x0000_t136" style="position:absolute;margin-left:0;margin-top:0;width:274pt;height:109.6pt;rotation:315;z-index:-251645440;mso-position-horizontal:center;mso-position-horizontal-relative:margin;mso-position-vertical:center;mso-position-vertical-relative:margin" o:allowincell="f" fillcolor="silver" stroked="f">
+        <v:shape id="PowerPlusWaterMarkObject3511102" o:spid="_x0000_s1086" type="#_x0000_t136" style="position:absolute;margin-left:0;margin-top:0;width:274pt;height:109.6pt;rotation:315;z-index:-251645440;mso-position-horizontal:center;mso-position-horizontal-relative:margin;mso-position-vertical:center;mso-position-vertical-relative:margin" o:allowincell="f" fillcolor="silver" stroked="f">
           <v:fill opacity=".5"/>
           <v:textpath style="font-family:&quot;Arial&quot;;font-size:1pt" string="DRAFT"/>
           <w10:wrap anchorx="margin" anchory="margin"/>
@@ -2581,7 +2762,7 @@
 </file>
 
 <file path=word/header5.xml><?xml version="1.0" encoding="utf-8"?>
-<w:hdr xmlns:wpc="http://schemas.microsoft.com/office/word/2010/wordprocessingCanvas" xmlns:mc="http://schemas.openxmlformats.org/markup-compatibility/2006" xmlns:o="urn:schemas-microsoft-com:office:office" xmlns:r="http://schemas.openxmlformats.org/officeDocument/2006/relationships" xmlns:m="http://schemas.openxmlformats.org/officeDocument/2006/math" xmlns:v="urn:schemas-microsoft-com:vml" xmlns:wp14="http://schemas.microsoft.com/office/word/2010/wordprocessingDrawing" xmlns:wp="http://schemas.openxmlformats.org/drawingml/2006/wordprocessingDrawing" xmlns:w10="urn:schemas-microsoft-com:office:word" xmlns:w="http://schemas.openxmlformats.org/wordprocessingml/2006/main" xmlns:w14="http://schemas.microsoft.com/office/word/2010/wordml" xmlns:w15="http://schemas.microsoft.com/office/word/2012/wordml" xmlns:wpg="http://schemas.microsoft.com/office/word/2010/wordprocessingGroup" xmlns:wpi="http://schemas.microsoft.com/office/word/2010/wordprocessingInk" xmlns:wne="http://schemas.microsoft.com/office/word/2006/wordml" xmlns:wps="http://schemas.microsoft.com/office/word/2010/wordprocessingShape" mc:Ignorable="w14 w15 wp14">
+<w:hdr xmlns:wpc="http://schemas.microsoft.com/office/word/2010/wordprocessingCanvas" xmlns:cx="http://schemas.microsoft.com/office/drawing/2014/chartex" xmlns:cx1="http://schemas.microsoft.com/office/drawing/2015/9/8/chartex" xmlns:cx2="http://schemas.microsoft.com/office/drawing/2015/10/21/chartex" xmlns:cx3="http://schemas.microsoft.com/office/drawing/2016/5/9/chartex" xmlns:cx4="http://schemas.microsoft.com/office/drawing/2016/5/10/chartex" xmlns:cx5="http://schemas.microsoft.com/office/drawing/2016/5/11/chartex" xmlns:cx6="http://schemas.microsoft.com/office/drawing/2016/5/12/chartex" xmlns:cx7="http://schemas.microsoft.com/office/drawing/2016/5/13/chartex" xmlns:cx8="http://schemas.microsoft.com/office/drawing/2016/5/14/chartex" xmlns:mc="http://schemas.openxmlformats.org/markup-compatibility/2006" xmlns:aink="http://schemas.microsoft.com/office/drawing/2016/ink" xmlns:am3d="http://schemas.microsoft.com/office/drawing/2017/model3d" xmlns:o="urn:schemas-microsoft-com:office:office" xmlns:oel="http://schemas.microsoft.com/office/2019/extlst" xmlns:r="http://schemas.openxmlformats.org/officeDocument/2006/relationships" xmlns:m="http://schemas.openxmlformats.org/officeDocument/2006/math" xmlns:v="urn:schemas-microsoft-com:vml" xmlns:wp14="http://schemas.microsoft.com/office/word/2010/wordprocessingDrawing" xmlns:wp="http://schemas.openxmlformats.org/drawingml/2006/wordprocessingDrawing" xmlns:w10="urn:schemas-microsoft-com:office:word" xmlns:w="http://schemas.openxmlformats.org/wordprocessingml/2006/main" xmlns:w14="http://schemas.microsoft.com/office/word/2010/wordml" xmlns:w15="http://schemas.microsoft.com/office/word/2012/wordml" xmlns:w16cex="http://schemas.microsoft.com/office/word/2018/wordml/cex" xmlns:w16cid="http://schemas.microsoft.com/office/word/2016/wordml/cid" xmlns:w16="http://schemas.microsoft.com/office/word/2018/wordml" xmlns:w16du="http://schemas.microsoft.com/office/word/2023/wordml/word16du" xmlns:w16sdtdh="http://schemas.microsoft.com/office/word/2020/wordml/sdtdatahash" xmlns:w16sdtfl="http://schemas.microsoft.com/office/word/2024/wordml/sdtformatlock" xmlns:w16se="http://schemas.microsoft.com/office/word/2015/wordml/symex" xmlns:wpg="http://schemas.microsoft.com/office/word/2010/wordprocessingGroup" xmlns:wpi="http://schemas.microsoft.com/office/word/2010/wordprocessingInk" xmlns:wne="http://schemas.microsoft.com/office/word/2006/wordml" xmlns:wps="http://schemas.microsoft.com/office/word/2010/wordprocessingShape" mc:Ignorable="w14 w15 w16se w16cid w16 w16cex w16sdtdh w16sdtfl w16du wp14">
   <w:p>
     <w:pPr>
       <w:pStyle w:val="Header"/>
@@ -2615,7 +2796,7 @@
           </v:handles>
           <o:lock v:ext="edit" text="t" shapetype="t"/>
         </v:shapetype>
-        <v:shape id="PowerPlusWaterMarkObject3511103" o:spid="_x0000_s2111" type="#_x0000_t136" style="position:absolute;margin-left:0;margin-top:0;width:274pt;height:109.6pt;rotation:315;z-index:-251644416;mso-position-horizontal:center;mso-position-horizontal-relative:margin;mso-position-vertical:center;mso-position-vertical-relative:margin" o:allowincell="f" fillcolor="silver" stroked="f">
+        <v:shape id="PowerPlusWaterMarkObject3511103" o:spid="_x0000_s1087" type="#_x0000_t136" style="position:absolute;margin-left:0;margin-top:0;width:274pt;height:109.6pt;rotation:315;z-index:-251644416;mso-position-horizontal:center;mso-position-horizontal-relative:margin;mso-position-vertical:center;mso-position-vertical-relative:margin" o:allowincell="f" fillcolor="silver" stroked="f">
           <v:fill opacity=".5"/>
           <v:textpath style="font-family:&quot;Arial&quot;;font-size:1pt" string="DRAFT"/>
           <w10:wrap anchorx="margin" anchory="margin"/>
@@ -2627,7 +2808,7 @@
 </file>
 
 <file path=word/header6.xml><?xml version="1.0" encoding="utf-8"?>
-<w:hdr xmlns:wpc="http://schemas.microsoft.com/office/word/2010/wordprocessingCanvas" xmlns:mc="http://schemas.openxmlformats.org/markup-compatibility/2006" xmlns:o="urn:schemas-microsoft-com:office:office" xmlns:r="http://schemas.openxmlformats.org/officeDocument/2006/relationships" xmlns:m="http://schemas.openxmlformats.org/officeDocument/2006/math" xmlns:v="urn:schemas-microsoft-com:vml" xmlns:wp14="http://schemas.microsoft.com/office/word/2010/wordprocessingDrawing" xmlns:wp="http://schemas.openxmlformats.org/drawingml/2006/wordprocessingDrawing" xmlns:w10="urn:schemas-microsoft-com:office:word" xmlns:w="http://schemas.openxmlformats.org/wordprocessingml/2006/main" xmlns:w14="http://schemas.microsoft.com/office/word/2010/wordml" xmlns:w15="http://schemas.microsoft.com/office/word/2012/wordml" xmlns:wpg="http://schemas.microsoft.com/office/word/2010/wordprocessingGroup" xmlns:wpi="http://schemas.microsoft.com/office/word/2010/wordprocessingInk" xmlns:wne="http://schemas.microsoft.com/office/word/2006/wordml" xmlns:wps="http://schemas.microsoft.com/office/word/2010/wordprocessingShape" mc:Ignorable="w14 w15 wp14">
+<w:hdr xmlns:wpc="http://schemas.microsoft.com/office/word/2010/wordprocessingCanvas" xmlns:cx="http://schemas.microsoft.com/office/drawing/2014/chartex" xmlns:cx1="http://schemas.microsoft.com/office/drawing/2015/9/8/chartex" xmlns:cx2="http://schemas.microsoft.com/office/drawing/2015/10/21/chartex" xmlns:cx3="http://schemas.microsoft.com/office/drawing/2016/5/9/chartex" xmlns:cx4="http://schemas.microsoft.com/office/drawing/2016/5/10/chartex" xmlns:cx5="http://schemas.microsoft.com/office/drawing/2016/5/11/chartex" xmlns:cx6="http://schemas.microsoft.com/office/drawing/2016/5/12/chartex" xmlns:cx7="http://schemas.microsoft.com/office/drawing/2016/5/13/chartex" xmlns:cx8="http://schemas.microsoft.com/office/drawing/2016/5/14/chartex" xmlns:mc="http://schemas.openxmlformats.org/markup-compatibility/2006" xmlns:aink="http://schemas.microsoft.com/office/drawing/2016/ink" xmlns:am3d="http://schemas.microsoft.com/office/drawing/2017/model3d" xmlns:o="urn:schemas-microsoft-com:office:office" xmlns:oel="http://schemas.microsoft.com/office/2019/extlst" xmlns:r="http://schemas.openxmlformats.org/officeDocument/2006/relationships" xmlns:m="http://schemas.openxmlformats.org/officeDocument/2006/math" xmlns:v="urn:schemas-microsoft-com:vml" xmlns:wp14="http://schemas.microsoft.com/office/word/2010/wordprocessingDrawing" xmlns:wp="http://schemas.openxmlformats.org/drawingml/2006/wordprocessingDrawing" xmlns:w10="urn:schemas-microsoft-com:office:word" xmlns:w="http://schemas.openxmlformats.org/wordprocessingml/2006/main" xmlns:w14="http://schemas.microsoft.com/office/word/2010/wordml" xmlns:w15="http://schemas.microsoft.com/office/word/2012/wordml" xmlns:w16cex="http://schemas.microsoft.com/office/word/2018/wordml/cex" xmlns:w16cid="http://schemas.microsoft.com/office/word/2016/wordml/cid" xmlns:w16="http://schemas.microsoft.com/office/word/2018/wordml" xmlns:w16du="http://schemas.microsoft.com/office/word/2023/wordml/word16du" xmlns:w16sdtdh="http://schemas.microsoft.com/office/word/2020/wordml/sdtdatahash" xmlns:w16sdtfl="http://schemas.microsoft.com/office/word/2024/wordml/sdtformatlock" xmlns:w16se="http://schemas.microsoft.com/office/word/2015/wordml/symex" xmlns:wpg="http://schemas.microsoft.com/office/word/2010/wordprocessingGroup" xmlns:wpi="http://schemas.microsoft.com/office/word/2010/wordprocessingInk" xmlns:wne="http://schemas.microsoft.com/office/word/2006/wordml" xmlns:wps="http://schemas.microsoft.com/office/word/2010/wordprocessingShape" mc:Ignorable="w14 w15 w16se w16cid w16 w16cex w16sdtdh w16sdtfl w16du wp14">
   <w:p>
     <w:pPr>
       <w:pStyle w:val="GlobeteamNavnetrk"/>
@@ -2666,7 +2847,7 @@
           </v:handles>
           <o:lock v:ext="edit" text="t" shapetype="t"/>
         </v:shapetype>
-        <v:shape id="PowerPlusWaterMarkObject3511101" o:spid="_x0000_s2109" type="#_x0000_t136" style="position:absolute;left:0;text-align:left;margin-left:0;margin-top:0;width:274pt;height:109.6pt;rotation:315;z-index:-251646464;mso-position-horizontal:center;mso-position-horizontal-relative:margin;mso-position-vertical:center;mso-position-vertical-relative:margin" o:allowincell="f" fillcolor="silver" stroked="f">
+        <v:shape id="PowerPlusWaterMarkObject3511101" o:spid="_x0000_s1085" type="#_x0000_t136" style="position:absolute;left:0;text-align:left;margin-left:0;margin-top:0;width:274pt;height:109.6pt;rotation:315;z-index:-251646464;mso-position-horizontal:center;mso-position-horizontal-relative:margin;mso-position-vertical:center;mso-position-vertical-relative:margin" o:allowincell="f" fillcolor="silver" stroked="f">
           <v:fill opacity=".5"/>
           <v:textpath style="font-family:&quot;Arial&quot;;font-size:1pt" string="DRAFT"/>
           <w10:wrap anchorx="margin" anchory="margin"/>
@@ -2684,8 +2865,8 @@
           <v:stroke joinstyle="miter"/>
           <v:path gradientshapeok="t" o:connecttype="rect"/>
         </v:shapetype>
-        <v:shape id="_x0000_s2078" type="#_x0000_t202" style="position:absolute;left:0;text-align:left;margin-left:14.2pt;margin-top:53pt;width:320.9pt;height:5.65pt;z-index:251647488;mso-position-horizontal-relative:page;mso-position-vertical-relative:page" fillcolor="#6579ae" stroked="f">
-          <v:textbox style="mso-next-textbox:#_x0000_s2078">
+        <v:shape id="_x0000_s1054" type="#_x0000_t202" style="position:absolute;left:0;text-align:left;margin-left:14.2pt;margin-top:53pt;width:320.9pt;height:5.65pt;z-index:251647488;mso-position-horizontal-relative:page;mso-position-vertical-relative:page" fillcolor="#6579ae" stroked="f">
+          <v:textbox style="mso-next-textbox:#_x0000_s1054">
             <w:txbxContent>
               <w:p/>
             </w:txbxContent>
@@ -2702,8 +2883,8 @@
         <w:szCs w:val="36"/>
       </w:rPr>
       <w:pict w14:anchorId="7B1ECC98">
-        <v:shape id="_x0000_s2076" type="#_x0000_t202" style="position:absolute;left:0;text-align:left;margin-left:14.2pt;margin-top:280.65pt;width:44.1pt;height:34pt;z-index:251646464;mso-position-horizontal-relative:page;mso-position-vertical-relative:page" fillcolor="#6579ae" stroked="f">
-          <v:textbox style="mso-next-textbox:#_x0000_s2076">
+        <v:shape id="_x0000_s1052" type="#_x0000_t202" style="position:absolute;left:0;text-align:left;margin-left:14.2pt;margin-top:280.65pt;width:44.1pt;height:34pt;z-index:251646464;mso-position-horizontal-relative:page;mso-position-vertical-relative:page" fillcolor="#6579ae" stroked="f">
+          <v:textbox style="mso-next-textbox:#_x0000_s1052">
             <w:txbxContent>
               <w:p/>
             </w:txbxContent>
@@ -2720,8 +2901,8 @@
         <w:szCs w:val="36"/>
       </w:rPr>
       <w:pict w14:anchorId="679BDDE0">
-        <v:shape id="_x0000_s2075" type="#_x0000_t202" style="position:absolute;left:0;text-align:left;margin-left:14.2pt;margin-top:223.95pt;width:44.1pt;height:22.7pt;z-index:251645440;mso-position-horizontal-relative:page;mso-position-vertical-relative:page" fillcolor="#6579ae" stroked="f">
-          <v:textbox style="mso-next-textbox:#_x0000_s2075">
+        <v:shape id="_x0000_s1051" type="#_x0000_t202" style="position:absolute;left:0;text-align:left;margin-left:14.2pt;margin-top:223.95pt;width:44.1pt;height:22.7pt;z-index:251645440;mso-position-horizontal-relative:page;mso-position-vertical-relative:page" fillcolor="#6579ae" stroked="f">
+          <v:textbox style="mso-next-textbox:#_x0000_s1051">
             <w:txbxContent>
               <w:p/>
             </w:txbxContent>
@@ -2796,8 +2977,8 @@
         <w:szCs w:val="36"/>
       </w:rPr>
       <w:pict w14:anchorId="787BFAC1">
-        <v:shape id="_x0000_s2073" type="#_x0000_t202" style="position:absolute;left:0;text-align:left;margin-left:14.2pt;margin-top:170.1pt;width:44.1pt;height:14.15pt;z-index:251643392;mso-position-horizontal-relative:page;mso-position-vertical-relative:page" fillcolor="#6579ae" stroked="f">
-          <v:textbox style="mso-next-textbox:#_x0000_s2073">
+        <v:shape id="_x0000_s1049" type="#_x0000_t202" style="position:absolute;left:0;text-align:left;margin-left:14.2pt;margin-top:170.1pt;width:44.1pt;height:14.15pt;z-index:251643392;mso-position-horizontal-relative:page;mso-position-vertical-relative:page" fillcolor="#6579ae" stroked="f">
+          <v:textbox style="mso-next-textbox:#_x0000_s1049">
             <w:txbxContent>
               <w:p/>
             </w:txbxContent>
@@ -2828,7 +3009,7 @@
 </file>
 
 <file path=word/numbering.xml><?xml version="1.0" encoding="utf-8"?>
-<w:numbering xmlns:wpc="http://schemas.microsoft.com/office/word/2010/wordprocessingCanvas" xmlns:mc="http://schemas.openxmlformats.org/markup-compatibility/2006" xmlns:o="urn:schemas-microsoft-com:office:office" xmlns:r="http://schemas.openxmlformats.org/officeDocument/2006/relationships" xmlns:m="http://schemas.openxmlformats.org/officeDocument/2006/math" xmlns:v="urn:schemas-microsoft-com:vml" xmlns:wp14="http://schemas.microsoft.com/office/word/2010/wordprocessingDrawing" xmlns:wp="http://schemas.openxmlformats.org/drawingml/2006/wordprocessingDrawing" xmlns:w10="urn:schemas-microsoft-com:office:word" xmlns:w="http://schemas.openxmlformats.org/wordprocessingml/2006/main" xmlns:w14="http://schemas.microsoft.com/office/word/2010/wordml" xmlns:w15="http://schemas.microsoft.com/office/word/2012/wordml" xmlns:wpg="http://schemas.microsoft.com/office/word/2010/wordprocessingGroup" xmlns:wpi="http://schemas.microsoft.com/office/word/2010/wordprocessingInk" xmlns:wne="http://schemas.microsoft.com/office/word/2006/wordml" xmlns:wps="http://schemas.microsoft.com/office/word/2010/wordprocessingShape" mc:Ignorable="w14 w15 wp14">
+<w:numbering xmlns:wpc="http://schemas.microsoft.com/office/word/2010/wordprocessingCanvas" xmlns:cx="http://schemas.microsoft.com/office/drawing/2014/chartex" xmlns:cx1="http://schemas.microsoft.com/office/drawing/2015/9/8/chartex" xmlns:cx2="http://schemas.microsoft.com/office/drawing/2015/10/21/chartex" xmlns:cx3="http://schemas.microsoft.com/office/drawing/2016/5/9/chartex" xmlns:cx4="http://schemas.microsoft.com/office/drawing/2016/5/10/chartex" xmlns:cx5="http://schemas.microsoft.com/office/drawing/2016/5/11/chartex" xmlns:cx6="http://schemas.microsoft.com/office/drawing/2016/5/12/chartex" xmlns:cx7="http://schemas.microsoft.com/office/drawing/2016/5/13/chartex" xmlns:cx8="http://schemas.microsoft.com/office/drawing/2016/5/14/chartex" xmlns:mc="http://schemas.openxmlformats.org/markup-compatibility/2006" xmlns:aink="http://schemas.microsoft.com/office/drawing/2016/ink" xmlns:am3d="http://schemas.microsoft.com/office/drawing/2017/model3d" xmlns:o="urn:schemas-microsoft-com:office:office" xmlns:oel="http://schemas.microsoft.com/office/2019/extlst" xmlns:r="http://schemas.openxmlformats.org/officeDocument/2006/relationships" xmlns:m="http://schemas.openxmlformats.org/officeDocument/2006/math" xmlns:v="urn:schemas-microsoft-com:vml" xmlns:wp14="http://schemas.microsoft.com/office/word/2010/wordprocessingDrawing" xmlns:wp="http://schemas.openxmlformats.org/drawingml/2006/wordprocessingDrawing" xmlns:w10="urn:schemas-microsoft-com:office:word" xmlns:w="http://schemas.openxmlformats.org/wordprocessingml/2006/main" xmlns:w14="http://schemas.microsoft.com/office/word/2010/wordml" xmlns:w15="http://schemas.microsoft.com/office/word/2012/wordml" xmlns:w16cex="http://schemas.microsoft.com/office/word/2018/wordml/cex" xmlns:w16cid="http://schemas.microsoft.com/office/word/2016/wordml/cid" xmlns:w16="http://schemas.microsoft.com/office/word/2018/wordml" xmlns:w16du="http://schemas.microsoft.com/office/word/2023/wordml/word16du" xmlns:w16sdtdh="http://schemas.microsoft.com/office/word/2020/wordml/sdtdatahash" xmlns:w16sdtfl="http://schemas.microsoft.com/office/word/2024/wordml/sdtformatlock" xmlns:w16se="http://schemas.microsoft.com/office/word/2015/wordml/symex" xmlns:wpg="http://schemas.microsoft.com/office/word/2010/wordprocessingGroup" xmlns:wpi="http://schemas.microsoft.com/office/word/2010/wordprocessingInk" xmlns:wne="http://schemas.microsoft.com/office/word/2006/wordml" xmlns:wps="http://schemas.microsoft.com/office/word/2010/wordprocessingShape" mc:Ignorable="w14 w15 w16se w16cid w16 w16cex w16sdtdh w16sdtfl w16du wp14">
   <w:abstractNum w:abstractNumId="0" w15:restartNumberingAfterBreak="0">
     <w:nsid w:val="FFFFFF89"/>
     <w:multiLevelType w:val="singleLevel"/>
@@ -4745,64 +4926,64 @@
       </w:pPr>
     </w:lvl>
   </w:abstractNum>
-  <w:num w:numId="1">
+  <w:num w:numId="1" w16cid:durableId="552887885">
     <w:abstractNumId w:val="0"/>
   </w:num>
-  <w:num w:numId="2">
+  <w:num w:numId="2" w16cid:durableId="1403136434">
     <w:abstractNumId w:val="1"/>
   </w:num>
-  <w:num w:numId="3">
+  <w:num w:numId="3" w16cid:durableId="876355819">
     <w:abstractNumId w:val="17"/>
   </w:num>
-  <w:num w:numId="4">
+  <w:num w:numId="4" w16cid:durableId="1768577394">
     <w:abstractNumId w:val="6"/>
   </w:num>
-  <w:num w:numId="5">
+  <w:num w:numId="5" w16cid:durableId="1736314847">
     <w:abstractNumId w:val="12"/>
   </w:num>
-  <w:num w:numId="6">
+  <w:num w:numId="6" w16cid:durableId="495339213">
     <w:abstractNumId w:val="13"/>
   </w:num>
-  <w:num w:numId="7">
+  <w:num w:numId="7" w16cid:durableId="941884131">
     <w:abstractNumId w:val="8"/>
   </w:num>
-  <w:num w:numId="8">
+  <w:num w:numId="8" w16cid:durableId="360671315">
     <w:abstractNumId w:val="4"/>
   </w:num>
-  <w:num w:numId="9">
+  <w:num w:numId="9" w16cid:durableId="148402967">
     <w:abstractNumId w:val="18"/>
   </w:num>
-  <w:num w:numId="10">
+  <w:num w:numId="10" w16cid:durableId="252401454">
     <w:abstractNumId w:val="19"/>
   </w:num>
-  <w:num w:numId="11">
+  <w:num w:numId="11" w16cid:durableId="130296323">
     <w:abstractNumId w:val="15"/>
   </w:num>
-  <w:num w:numId="12">
+  <w:num w:numId="12" w16cid:durableId="1345204732">
     <w:abstractNumId w:val="2"/>
   </w:num>
-  <w:num w:numId="13">
+  <w:num w:numId="13" w16cid:durableId="375348559">
     <w:abstractNumId w:val="9"/>
   </w:num>
-  <w:num w:numId="14">
+  <w:num w:numId="14" w16cid:durableId="1174228320">
     <w:abstractNumId w:val="10"/>
   </w:num>
-  <w:num w:numId="15">
+  <w:num w:numId="15" w16cid:durableId="1615163179">
     <w:abstractNumId w:val="11"/>
   </w:num>
-  <w:num w:numId="16">
+  <w:num w:numId="16" w16cid:durableId="290018552">
     <w:abstractNumId w:val="7"/>
   </w:num>
-  <w:num w:numId="17">
+  <w:num w:numId="17" w16cid:durableId="895581435">
     <w:abstractNumId w:val="14"/>
   </w:num>
-  <w:num w:numId="18">
+  <w:num w:numId="18" w16cid:durableId="1231887975">
     <w:abstractNumId w:val="16"/>
   </w:num>
-  <w:num w:numId="19">
+  <w:num w:numId="19" w16cid:durableId="2002391533">
     <w:abstractNumId w:val="5"/>
   </w:num>
-  <w:num w:numId="20">
+  <w:num w:numId="20" w16cid:durableId="801384624">
     <w:abstractNumId w:val="3"/>
   </w:num>
   <w:numIdMacAtCleanup w:val="3"/>
@@ -4810,7 +4991,7 @@
 </file>
 
 <file path=word/styles.xml><?xml version="1.0" encoding="utf-8"?>
-<w:styles xmlns:mc="http://schemas.openxmlformats.org/markup-compatibility/2006" xmlns:r="http://schemas.openxmlformats.org/officeDocument/2006/relationships" xmlns:w="http://schemas.openxmlformats.org/wordprocessingml/2006/main" xmlns:w14="http://schemas.microsoft.com/office/word/2010/wordml" xmlns:w15="http://schemas.microsoft.com/office/word/2012/wordml" mc:Ignorable="w14 w15">
+<w:styles xmlns:mc="http://schemas.openxmlformats.org/markup-compatibility/2006" xmlns:r="http://schemas.openxmlformats.org/officeDocument/2006/relationships" xmlns:w="http://schemas.openxmlformats.org/wordprocessingml/2006/main" xmlns:w14="http://schemas.microsoft.com/office/word/2010/wordml" xmlns:w15="http://schemas.microsoft.com/office/word/2012/wordml" xmlns:w16cex="http://schemas.microsoft.com/office/word/2018/wordml/cex" xmlns:w16cid="http://schemas.microsoft.com/office/word/2016/wordml/cid" xmlns:w16="http://schemas.microsoft.com/office/word/2018/wordml" xmlns:w16du="http://schemas.microsoft.com/office/word/2023/wordml/word16du" xmlns:w16sdtdh="http://schemas.microsoft.com/office/word/2020/wordml/sdtdatahash" xmlns:w16sdtfl="http://schemas.microsoft.com/office/word/2024/wordml/sdtformatlock" xmlns:w16se="http://schemas.microsoft.com/office/word/2015/wordml/symex" mc:Ignorable="w14 w15 w16se w16cid w16 w16cex w16sdtdh w16sdtfl w16du">
   <w:docDefaults>
     <w:rPrDefault>
       <w:rPr>
@@ -4820,7 +5001,7 @@
     </w:rPrDefault>
     <w:pPrDefault/>
   </w:docDefaults>
-  <w:latentStyles w:defLockedState="0" w:defUIPriority="0" w:defSemiHidden="0" w:defUnhideWhenUsed="0" w:defQFormat="0" w:count="371">
+  <w:latentStyles w:defLockedState="0" w:defUIPriority="0" w:defSemiHidden="0" w:defUnhideWhenUsed="0" w:defQFormat="0" w:count="376">
     <w:lsdException w:name="Normal" w:qFormat="1"/>
     <w:lsdException w:name="heading 1" w:qFormat="1"/>
     <w:lsdException w:name="heading 2" w:qFormat="1"/>
@@ -5185,6 +5366,11 @@
     <w:lsdException w:name="List Table 5 Dark Accent 6" w:uiPriority="50"/>
     <w:lsdException w:name="List Table 6 Colorful Accent 6" w:uiPriority="51"/>
     <w:lsdException w:name="List Table 7 Colorful Accent 6" w:uiPriority="52"/>
+    <w:lsdException w:name="Mention" w:semiHidden="1" w:uiPriority="99" w:unhideWhenUsed="1"/>
+    <w:lsdException w:name="Smart Hyperlink" w:semiHidden="1" w:uiPriority="99" w:unhideWhenUsed="1"/>
+    <w:lsdException w:name="Hashtag" w:semiHidden="1" w:uiPriority="99" w:unhideWhenUsed="1"/>
+    <w:lsdException w:name="Unresolved Mention" w:semiHidden="1" w:uiPriority="99" w:unhideWhenUsed="1"/>
+    <w:lsdException w:name="Smart Link" w:semiHidden="1" w:uiPriority="99" w:unhideWhenUsed="1"/>
   </w:latentStyles>
   <w:style w:type="paragraph" w:default="1" w:styleId="Normal">
     <w:name w:val="Normal"/>

</xml_diff>